<commit_message>
1.9.4, 2.0.4, 3.0.1: rebuilt pages; 3.0.1 solution zip and guide screenshots
- Data_Model_Explorer.html rebuilt in each (empty template embedded, as before)
- FORMUS_DataModelExplorer_3_0_1_0.zip replaces 3_0_0_0
- 3.0.1 guide: environment screenshots show the searchable solution lists

Co-Authored-By: Claude Opus 5.5 <noreply@anthropic.com>
Claude-Session: https://claude.ai/code/session_01SKe3s5TvTWyeqUT38hd6Ss
</commit_message>
<xml_diff>
--- a/data-model-explorer-live/docs/User_Guide.docx
+++ b/data-model-explorer-live/docs/User_Guide.docx
@@ -45,7 +45,7 @@
         <w:t xml:space="preserve"> </w:t>
       </w:r>
       <w:r>
-        <w:t xml:space="preserve">3.0.0</w:t>
+        <w:t xml:space="preserve">3.0.1</w:t>
       </w:r>
       <w:r>
         <w:t xml:space="preserve"> </w:t>
@@ -6133,7 +6133,7 @@
         <w:rPr>
           <w:rStyle w:val="VerbatimChar"/>
         </w:rPr>
-        <w:t xml:space="preserve">FORMUS_DataModelExplorer_3_0_0_0.zip</w:t>
+        <w:t xml:space="preserve">FORMUS_DataModelExplorer_3_0_1_0.zip</w:t>
       </w:r>
       <w:r>
         <w:t xml:space="preserve"> </w:t>
@@ -6246,7 +6246,7 @@
       <w:r>
         <w:drawing>
           <wp:inline>
-            <wp:extent cx="3172968" cy="4271303"/>
+            <wp:extent cx="3063240" cy="7318787"/>
             <wp:effectExtent b="0" l="0" r="0" t="0"/>
             <wp:docPr descr="This environment" title="" id="80" name="Picture"/>
             <a:graphic>
@@ -6267,7 +6267,7 @@
                   <pic:spPr bwMode="auto">
                     <a:xfrm>
                       <a:off x="0" y="0"/>
-                      <a:ext cx="3172968" cy="4271303"/>
+                      <a:ext cx="3063240" cy="7318787"/>
                     </a:xfrm>
                     <a:prstGeom prst="rect">
                       <a:avLst/>
@@ -6309,7 +6309,7 @@
         <w:t xml:space="preserve"> </w:t>
       </w:r>
       <w:r>
-        <w:t xml:space="preserve">Pick a solution ·</w:t>
+        <w:t xml:space="preserve">Find and pick a solution ·</w:t>
       </w:r>
       <w:r>
         <w:t xml:space="preserve"> </w:t>
@@ -6325,7 +6325,7 @@
         <w:t xml:space="preserve"> </w:t>
       </w:r>
       <w:r>
-        <w:t xml:space="preserve">Load as model ·</w:t>
+        <w:t xml:space="preserve">Load it as the model ·</w:t>
       </w:r>
       <w:r>
         <w:t xml:space="preserve"> </w:t>
@@ -6379,7 +6379,7 @@
         <w:pStyle w:val="Compact"/>
       </w:pPr>
       <w:r>
-        <w:t xml:space="preserve">Pick the solution, for example</w:t>
+        <w:t xml:space="preserve">Find the solution in the list and click it, for example</w:t>
       </w:r>
       <w:r>
         <w:t xml:space="preserve"> </w:t>
@@ -6391,7 +6391,23 @@
         <w:t xml:space="preserve">FORMUS import test</w:t>
       </w:r>
       <w:r>
-        <w:t xml:space="preserve">.</w:t>
+        <w:t xml:space="preserve">. Type in the search box to find it by name or unique name. Your unmanaged solutions are listed first; managed ones are folded under</w:t>
+      </w:r>
+      <w:r>
+        <w:t xml:space="preserve"> </w:t>
+      </w:r>
+      <w:r>
+        <w:rPr>
+          <w:bCs/>
+          <w:b/>
+        </w:rPr>
+        <w:t xml:space="preserve">Managed</w:t>
+      </w:r>
+      <w:r>
+        <w:t xml:space="preserve"> </w:t>
+      </w:r>
+      <w:r>
+        <w:t xml:space="preserve">and open when you click it or search.</w:t>
       </w:r>
     </w:p>
     <w:p>
@@ -6413,10 +6429,13 @@
           <w:bCs/>
           <w:b/>
         </w:rPr>
-        <w:t xml:space="preserve">Load as model</w:t>
-      </w:r>
-      <w:r>
-        <w:t xml:space="preserve">. The page reads the solution’s tables and, for each one, its columns, types, required levels, choice options, number and text settings, lookups with their cascade, and N:N relationships. Alternate keys are read too and shown on each table page under From Dataverse.</w:t>
+        <w:t xml:space="preserve">Load … as the model</w:t>
+      </w:r>
+      <w:r>
+        <w:t xml:space="preserve"> </w:t>
+      </w:r>
+      <w:r>
+        <w:t xml:space="preserve">(the button names the solution). The page reads the solution’s tables and, for each one, its columns, types, required levels, choice options, number and text settings, lookups with their cascade, and N:N relationships. Alternate keys are read too and shown on each table page under From Dataverse.</w:t>
       </w:r>
     </w:p>
     <w:p>
@@ -6616,7 +6635,7 @@
       <w:r>
         <w:drawing>
           <wp:inline>
-            <wp:extent cx="3172968" cy="4759452"/>
+            <wp:extent cx="3063240" cy="7318787"/>
             <wp:effectExtent b="0" l="0" r="0" t="0"/>
             <wp:docPr descr="The check against a managed environment" title="" id="85" name="Picture"/>
             <a:graphic>
@@ -6637,7 +6656,7 @@
                   <pic:spPr bwMode="auto">
                     <a:xfrm>
                       <a:off x="0" y="0"/>
-                      <a:ext cx="3172968" cy="4759452"/>
+                      <a:ext cx="3063240" cy="7318787"/>
                     </a:xfrm>
                     <a:prstGeom prst="rect">
                       <a:avLst/>
@@ -6904,7 +6923,7 @@
       <w:r>
         <w:drawing>
           <wp:inline>
-            <wp:extent cx="5334000" cy="3185583"/>
+            <wp:extent cx="5334000" cy="4815416"/>
             <wp:effectExtent b="0" l="0" r="0" t="0"/>
             <wp:docPr descr="The differences in Checks" title="" id="88" name="Picture"/>
             <a:graphic>
@@ -6925,7 +6944,7 @@
                   <pic:spPr bwMode="auto">
                     <a:xfrm>
                       <a:off x="0" y="0"/>
-                      <a:ext cx="5334000" cy="3185583"/>
+                      <a:ext cx="5334000" cy="4815416"/>
                     </a:xfrm>
                     <a:prstGeom prst="rect">
                       <a:avLst/>

</xml_diff>

<commit_message>
Build solution: a Tables only option (all versions)
The Build a Dataverse solution dialog asks what to build: tables, fields and relationships
(as before) or Tables only, which builds each new table with just its primary name column.
Everything else is left out and listed in build-report.csv; no hand-build list. The choice is
remembered per workbook. Checked with pac solution unpack/pack.

1.9.5, 2.0.5, 3.0.2, 4.0.2, 5.0.2. Guide step and screenshot 17 updated; Word guides rebuilt.
Pages, solution zips and the XrmToolBox dll follow once the test suites pass.

Co-Authored-By: Claude Opus 5.5 <noreply@anthropic.com>
Claude-Session: https://claude.ai/code/session_01SKe3s5TvTWyeqUT38hd6Ss
</commit_message>
<xml_diff>
--- a/data-model-explorer-live/docs/User_Guide.docx
+++ b/data-model-explorer-live/docs/User_Guide.docx
@@ -45,7 +45,7 @@
         <w:t xml:space="preserve"> </w:t>
       </w:r>
       <w:r>
-        <w:t xml:space="preserve">3.0.1</w:t>
+        <w:t xml:space="preserve">3.0.2</w:t>
       </w:r>
       <w:r>
         <w:t xml:space="preserve"> </w:t>
@@ -8350,7 +8350,49 @@
         <w:pStyle w:val="Compact"/>
       </w:pPr>
       <w:r>
-        <w:t xml:space="preserve">Fill in the dialog. The prefix and choice value prefix are suggested from the workbook.</w:t>
+        <w:t xml:space="preserve">Choose</w:t>
+      </w:r>
+      <w:r>
+        <w:t xml:space="preserve"> </w:t>
+      </w:r>
+      <w:r>
+        <w:rPr>
+          <w:bCs/>
+          <w:b/>
+        </w:rPr>
+        <w:t xml:space="preserve">What to build</w:t>
+      </w:r>
+      <w:r>
+        <w:t xml:space="preserve">:</w:t>
+      </w:r>
+      <w:r>
+        <w:t xml:space="preserve"> </w:t>
+      </w:r>
+      <w:r>
+        <w:rPr>
+          <w:bCs/>
+          <w:b/>
+        </w:rPr>
+        <w:t xml:space="preserve">Tables, fields and relationships</w:t>
+      </w:r>
+      <w:r>
+        <w:t xml:space="preserve"> </w:t>
+      </w:r>
+      <w:r>
+        <w:t xml:space="preserve">(everything with your prefix), or</w:t>
+      </w:r>
+      <w:r>
+        <w:t xml:space="preserve"> </w:t>
+      </w:r>
+      <w:r>
+        <w:rPr>
+          <w:bCs/>
+          <w:b/>
+        </w:rPr>
+        <w:t xml:space="preserve">Tables only</w:t>
+      </w:r>
+      <w:r>
+        <w:t xml:space="preserve">, which builds each new table with just its primary name column, for when you want the tables in place first and the fields later. The choice is remembered for the workbook.</w:t>
       </w:r>
     </w:p>
     <w:p>
@@ -8362,20 +8404,7 @@
         <w:pStyle w:val="Compact"/>
       </w:pPr>
       <w:r>
-        <w:t xml:space="preserve">Read</w:t>
-      </w:r>
-      <w:r>
-        <w:t xml:space="preserve"> </w:t>
-      </w:r>
-      <w:r>
-        <w:rPr>
-          <w:bCs/>
-          <w:b/>
-        </w:rPr>
-        <w:t xml:space="preserve">Will be built</w:t>
-      </w:r>
-      <w:r>
-        <w:t xml:space="preserve">: new tables, existing tables gaining your fields, fields and relationships, plus what is to build by hand or not included and why.</w:t>
+        <w:t xml:space="preserve">Fill in the rest of the dialog. The prefix and choice value prefix are suggested from the workbook.</w:t>
       </w:r>
     </w:p>
     <w:p>
@@ -8387,6 +8416,31 @@
         <w:pStyle w:val="Compact"/>
       </w:pPr>
       <w:r>
+        <w:t xml:space="preserve">Read</w:t>
+      </w:r>
+      <w:r>
+        <w:t xml:space="preserve"> </w:t>
+      </w:r>
+      <w:r>
+        <w:rPr>
+          <w:bCs/>
+          <w:b/>
+        </w:rPr>
+        <w:t xml:space="preserve">Will be built</w:t>
+      </w:r>
+      <w:r>
+        <w:t xml:space="preserve">: new tables, existing tables gaining your fields, fields and relationships, plus what is to build by hand or not included and why.</w:t>
+      </w:r>
+    </w:p>
+    <w:p>
+      <w:pPr>
+        <w:numPr>
+          <w:ilvl w:val="0"/>
+          <w:numId w:val="1019"/>
+        </w:numPr>
+        <w:pStyle w:val="Compact"/>
+      </w:pPr>
+      <w:r>
         <w:t xml:space="preserve">Click</w:t>
       </w:r>
       <w:r>
@@ -8422,7 +8476,7 @@
       <w:r>
         <w:drawing>
           <wp:inline>
-            <wp:extent cx="4828032" cy="3574694"/>
+            <wp:extent cx="4828032" cy="4291584"/>
             <wp:effectExtent b="0" l="0" r="0" t="0"/>
             <wp:docPr descr="The Build a Dataverse solution dialog" title="" id="108" name="Picture"/>
             <a:graphic>
@@ -8443,7 +8497,7 @@
                   <pic:spPr bwMode="auto">
                     <a:xfrm>
                       <a:off x="0" y="0"/>
-                      <a:ext cx="4828032" cy="3574694"/>
+                      <a:ext cx="4828032" cy="4291584"/>
                     </a:xfrm>
                     <a:prstGeom prst="rect">
                       <a:avLst/>
@@ -8485,6 +8539,22 @@
         <w:t xml:space="preserve"> </w:t>
       </w:r>
       <w:r>
+        <w:t xml:space="preserve">What to build ·</w:t>
+      </w:r>
+      <w:r>
+        <w:t xml:space="preserve"> </w:t>
+      </w:r>
+      <w:r>
+        <w:rPr>
+          <w:bCs/>
+          <w:b/>
+        </w:rPr>
+        <w:t xml:space="preserve">2</w:t>
+      </w:r>
+      <w:r>
+        <w:t xml:space="preserve"> </w:t>
+      </w:r>
+      <w:r>
         <w:t xml:space="preserve">Publisher unique name ·</w:t>
       </w:r>
       <w:r>
@@ -8495,7 +8565,7 @@
           <w:bCs/>
           <w:b/>
         </w:rPr>
-        <w:t xml:space="preserve">2</w:t>
+        <w:t xml:space="preserve">3</w:t>
       </w:r>
       <w:r>
         <w:t xml:space="preserve"> </w:t>
@@ -8511,7 +8581,7 @@
           <w:bCs/>
           <w:b/>
         </w:rPr>
-        <w:t xml:space="preserve">3</w:t>
+        <w:t xml:space="preserve">4</w:t>
       </w:r>
       <w:r>
         <w:t xml:space="preserve"> </w:t>
@@ -8527,7 +8597,7 @@
           <w:bCs/>
           <w:b/>
         </w:rPr>
-        <w:t xml:space="preserve">4</w:t>
+        <w:t xml:space="preserve">5</w:t>
       </w:r>
       <w:r>
         <w:t xml:space="preserve"> </w:t>
@@ -8543,7 +8613,7 @@
           <w:bCs/>
           <w:b/>
         </w:rPr>
-        <w:t xml:space="preserve">5</w:t>
+        <w:t xml:space="preserve">6</w:t>
       </w:r>
       <w:r>
         <w:t xml:space="preserve"> </w:t>

</xml_diff>

<commit_message>
1.9.6, 2.0.6, 3.0.3, 4.0.3, 5.0.3: rebuilt pages, solution zips, guides and the XrmToolBox dll
- Data_Model_Explorer.html rebuilt in each (empty template embedded)
- FORMUS_DataModelExplorer_3_0_3_0, 4_0_3_0, 5_0_3_0 replace the 0_2_0 zips
- Guide screenshots retaken (3.0 to 5.0) and Word guides rebuilt (all)
- xrmtoolbox/release dll rebuilt as 5.0.3
- 3.0 and 4.0: the Dataverse panel no longer mentions XrmToolBox
- All suites pass: 302, 347, 403, 417, 417

Co-Authored-By: Claude Opus 5.5 <noreply@anthropic.com>
Claude-Session: https://claude.ai/code/session_01SKe3s5TvTWyeqUT38hd6Ss
</commit_message>
<xml_diff>
--- a/data-model-explorer-live/docs/User_Guide.docx
+++ b/data-model-explorer-live/docs/User_Guide.docx
@@ -45,7 +45,7 @@
         <w:t xml:space="preserve"> </w:t>
       </w:r>
       <w:r>
-        <w:t xml:space="preserve">3.0.2</w:t>
+        <w:t xml:space="preserve">3.0.3</w:t>
       </w:r>
       <w:r>
         <w:t xml:space="preserve"> </w:t>
@@ -1631,7 +1631,7 @@
         <w:t xml:space="preserve"> </w:t>
       </w:r>
       <w:r>
-        <w:t xml:space="preserve">Check against Dataverse…</w:t>
+        <w:t xml:space="preserve">Compare with a solution…</w:t>
       </w:r>
     </w:p>
     <w:p>
@@ -2474,6 +2474,106 @@
           </w:p>
         </w:tc>
       </w:tr>
+      <w:tr>
+        <w:tc>
+          <w:tcPr/>
+          <w:p>
+            <w:pPr>
+              <w:pStyle w:val="Compact"/>
+              <w:jc w:val="left"/>
+            </w:pPr>
+            <w:r>
+              <w:t xml:space="preserve">Copy of a system field</w:t>
+            </w:r>
+          </w:p>
+        </w:tc>
+        <w:tc>
+          <w:tcPr/>
+          <w:p>
+            <w:pPr>
+              <w:pStyle w:val="Compact"/>
+              <w:jc w:val="left"/>
+            </w:pPr>
+            <w:r>
+              <w:t xml:space="preserve">Warning</w:t>
+            </w:r>
+          </w:p>
+        </w:tc>
+        <w:tc>
+          <w:tcPr/>
+          <w:p>
+            <w:pPr>
+              <w:pStyle w:val="Compact"/>
+              <w:jc w:val="left"/>
+            </w:pPr>
+            <w:r>
+              <w:t xml:space="preserve">A field such as</w:t>
+            </w:r>
+            <w:r>
+              <w:t xml:space="preserve"> </w:t>
+            </w:r>
+            <w:r>
+              <w:rPr>
+                <w:rStyle w:val="VerbatimChar"/>
+              </w:rPr>
+              <w:t xml:space="preserve">fp_createdon</w:t>
+            </w:r>
+            <w:r>
+              <w:t xml:space="preserve"> </w:t>
+            </w:r>
+            <w:r>
+              <w:t xml:space="preserve">would be a second copy of a column Dataverse creates on every table (</w:t>
+            </w:r>
+            <w:r>
+              <w:rPr>
+                <w:rStyle w:val="VerbatimChar"/>
+              </w:rPr>
+              <w:t xml:space="preserve">createdon</w:t>
+            </w:r>
+            <w:r>
+              <w:t xml:space="preserve">). Use the system field and remove the row; it is left out of a generated solution</w:t>
+            </w:r>
+          </w:p>
+        </w:tc>
+      </w:tr>
+      <w:tr>
+        <w:tc>
+          <w:tcPr/>
+          <w:p>
+            <w:pPr>
+              <w:pStyle w:val="Compact"/>
+              <w:jc w:val="left"/>
+            </w:pPr>
+            <w:r>
+              <w:t xml:space="preserve">Prefix not one of yours</w:t>
+            </w:r>
+          </w:p>
+        </w:tc>
+        <w:tc>
+          <w:tcPr/>
+          <w:p>
+            <w:pPr>
+              <w:pStyle w:val="Compact"/>
+              <w:jc w:val="left"/>
+            </w:pPr>
+            <w:r>
+              <w:t xml:space="preserve">Info</w:t>
+            </w:r>
+          </w:p>
+        </w:tc>
+        <w:tc>
+          <w:tcPr/>
+          <w:p>
+            <w:pPr>
+              <w:pStyle w:val="Compact"/>
+              <w:jc w:val="left"/>
+            </w:pPr>
+            <w:r>
+              <w:t xml:space="preserve">A custom field’s prefix is neither one of your publishers’ nor a Microsoft one. Add it in Publishers and prefixes if it is yours, or correct the name. Only checked once you have saved your publishers</w:t>
+            </w:r>
+          </w:p>
+        </w:tc>
+      </w:tr>
     </w:tbl>
     <w:p>
       <w:pPr>
@@ -2498,7 +2598,7 @@
         <w:t xml:space="preserve"> </w:t>
       </w:r>
       <w:r>
-        <w:t xml:space="preserve">appear only after you load Dataverse metadata (see Comparing with Dataverse).</w:t>
+        <w:t xml:space="preserve">appear only after you load Dataverse metadata (see Comparing with a solution).</w:t>
       </w:r>
     </w:p>
     <w:p>
@@ -3537,6 +3637,52 @@
           <w:bCs/>
           <w:b/>
         </w:rPr>
+        <w:t xml:space="preserve">Back.</w:t>
+      </w:r>
+      <w:r>
+        <w:t xml:space="preserve"> </w:t>
+      </w:r>
+      <w:r>
+        <w:t xml:space="preserve">The ← button beside the search box returns to the previous screen (a table, the Overview, Checks, the ERD), as do the browser’s Back,</w:t>
+      </w:r>
+      <w:r>
+        <w:t xml:space="preserve"> </w:t>
+      </w:r>
+      <w:r>
+        <w:rPr>
+          <w:rStyle w:val="VerbatimChar"/>
+        </w:rPr>
+        <w:t xml:space="preserve">Alt</w:t>
+      </w:r>
+      <w:r>
+        <w:t xml:space="preserve">+</w:t>
+      </w:r>
+      <w:r>
+        <w:rPr>
+          <w:rStyle w:val="VerbatimChar"/>
+        </w:rPr>
+        <w:t xml:space="preserve">←</w:t>
+      </w:r>
+      <w:r>
+        <w:t xml:space="preserve"> </w:t>
+      </w:r>
+      <w:r>
+        <w:t xml:space="preserve">and a mouse’s back button.</w:t>
+      </w:r>
+    </w:p>
+    <w:p>
+      <w:pPr>
+        <w:numPr>
+          <w:ilvl w:val="0"/>
+          <w:numId w:val="1006"/>
+        </w:numPr>
+        <w:pStyle w:val="Compact"/>
+      </w:pPr>
+      <w:r>
+        <w:rPr>
+          <w:bCs/>
+          <w:b/>
+        </w:rPr>
         <w:t xml:space="preserve">Column filters.</w:t>
       </w:r>
       <w:r>
@@ -3987,6 +4133,93 @@
     </w:p>
     <w:p>
       <w:pPr>
+        <w:numPr>
+          <w:ilvl w:val="0"/>
+          <w:numId w:val="1007"/>
+        </w:numPr>
+        <w:pStyle w:val="Compact"/>
+      </w:pPr>
+      <w:r>
+        <w:t xml:space="preserve">Changing a field’s</w:t>
+      </w:r>
+      <w:r>
+        <w:t xml:space="preserve"> </w:t>
+      </w:r>
+      <w:r>
+        <w:rPr>
+          <w:bCs/>
+          <w:b/>
+        </w:rPr>
+        <w:t xml:space="preserve">Attribute Type</w:t>
+      </w:r>
+      <w:r>
+        <w:t xml:space="preserve"> </w:t>
+      </w:r>
+      <w:r>
+        <w:t xml:space="preserve">to</w:t>
+      </w:r>
+      <w:r>
+        <w:t xml:space="preserve"> </w:t>
+      </w:r>
+      <w:r>
+        <w:rPr>
+          <w:bCs/>
+          <w:b/>
+        </w:rPr>
+        <w:t xml:space="preserve">Lookup</w:t>
+      </w:r>
+      <w:r>
+        <w:t xml:space="preserve"> </w:t>
+      </w:r>
+      <w:r>
+        <w:t xml:space="preserve">asks which table it looks up to, then adds</w:t>
+      </w:r>
+      <w:r>
+        <w:t xml:space="preserve"> </w:t>
+      </w:r>
+      <w:r>
+        <w:rPr>
+          <w:rStyle w:val="VerbatimChar"/>
+        </w:rPr>
+        <w:t xml:space="preserve">Targets:</w:t>
+      </w:r>
+      <w:r>
+        <w:t xml:space="preserve"> </w:t>
+      </w:r>
+      <w:r>
+        <w:t xml:space="preserve">and the table to Additional data (and N:1 as the Relationship Type if it is blank).</w:t>
+      </w:r>
+      <w:r>
+        <w:t xml:space="preserve"> </w:t>
+      </w:r>
+      <w:r>
+        <w:rPr>
+          <w:bCs/>
+          <w:b/>
+        </w:rPr>
+        <w:t xml:space="preserve">Skip</w:t>
+      </w:r>
+      <w:r>
+        <w:t xml:space="preserve"> </w:t>
+      </w:r>
+      <w:r>
+        <w:t xml:space="preserve">leaves it for Checks to flag.</w:t>
+      </w:r>
+    </w:p>
+    <w:p>
+      <w:pPr>
+        <w:numPr>
+          <w:ilvl w:val="0"/>
+          <w:numId w:val="1007"/>
+        </w:numPr>
+        <w:pStyle w:val="Compact"/>
+      </w:pPr>
+      <w:r>
+        <w:t xml:space="preserve">A dropdown or any text that is cut short shows in full when you hover over it.</w:t>
+      </w:r>
+    </w:p>
+    <w:p>
+      <w:pPr>
         <w:pStyle w:val="CaptionedFigure"/>
       </w:pPr>
       <w:r>
@@ -5456,7 +5689,7 @@
         <w:pStyle w:val="BodyText"/>
       </w:pPr>
       <w:r>
-        <w:t xml:space="preserve">The first two only rewrite the cells you changed; formatting, validations and everything else stay byte for byte. Added rows go into the empty rows after the field list and new table details into empty rows above it, so nothing moves. The file is then read back and every edit checked. If any edit can’t be written (for example there is no empty row left before the Forms section),</w:t>
+        <w:t xml:space="preserve">The first two only rewrite the cells you changed; formatting, validations and everything else stay byte for byte. Added rows go into the empty rows after the field list. A table detail the sheet doesn’t have yet (for example Primary Name Column or Primary Key) goes into an empty row above the field list or, when there is none, into a row inserted just below the last detail: everything underneath moves down with it, including merged cells, dropdown lists, conditional formatting, filters and the frozen header. The file is then read back and every edit checked. If any edit can’t be written (for example there is no empty row left before the Forms section, or the sheet has an Excel table, a drawing, comments, or a formula on another sheet pointing at it, so rows can’t be inserted),</w:t>
       </w:r>
       <w:r>
         <w:t xml:space="preserve"> </w:t>
@@ -6133,7 +6366,7 @@
         <w:rPr>
           <w:rStyle w:val="VerbatimChar"/>
         </w:rPr>
-        <w:t xml:space="preserve">FORMUS_DataModelExplorer_3_0_2_0.zip</w:t>
+        <w:t xml:space="preserve">FORMUS_DataModelExplorer_3_0_3_0.zip</w:t>
       </w:r>
       <w:r>
         <w:t xml:space="preserve"> </w:t>
@@ -7105,7 +7338,7 @@
       <w:r>
         <w:drawing>
           <wp:inline>
-            <wp:extent cx="1755648" cy="1380134"/>
+            <wp:extent cx="2660904" cy="1700834"/>
             <wp:effectExtent b="0" l="0" r="0" t="0"/>
             <wp:docPr descr="The More menu" title="" id="93" name="Picture"/>
             <a:graphic>
@@ -7126,7 +7359,7 @@
                   <pic:spPr bwMode="auto">
                     <a:xfrm>
                       <a:off x="0" y="0"/>
-                      <a:ext cx="1755648" cy="1380134"/>
+                      <a:ext cx="2660904" cy="1700834"/>
                     </a:xfrm>
                     <a:prstGeom prst="rect">
                       <a:avLst/>
@@ -7797,13 +8030,13 @@
     </w:p>
     <w:bookmarkEnd w:id="101"/>
     <w:bookmarkEnd w:id="102"/>
-    <w:bookmarkStart w:id="106" w:name="comparing-with-dataverse"/>
+    <w:bookmarkStart w:id="106" w:name="comparing-with-a-solution"/>
     <w:p>
       <w:pPr>
         <w:pStyle w:val="Heading2"/>
       </w:pPr>
       <w:r>
-        <w:t xml:space="preserve">Comparing with Dataverse</w:t>
+        <w:t xml:space="preserve">Comparing with a solution</w:t>
       </w:r>
     </w:p>
     <w:p>
@@ -7811,7 +8044,7 @@
         <w:pStyle w:val="FirstParagraph"/>
       </w:pPr>
       <w:r>
-        <w:t xml:space="preserve">The page can check the workbook against the real table definitions in a Dataverse environment: fields, types, required levels, relationships (with N:N and cascade settings) and alternate keys. It stays offline: you open the links yourself while signed in, save what they return, and load the files.</w:t>
+        <w:t xml:space="preserve">Opened as a file, the page checks the workbook against a solution exported from Power Apps: its tables, fields (types, required levels, custom or standard), relationships with their cascade settings, N:N and alternate keys. Nothing is uploaded: the file is read in the browser. Inside Dynamics 365, the same panel picks a solution straight from the environment instead (Using it inside Dynamics 365).</w:t>
       </w:r>
     </w:p>
     <w:p>
@@ -7823,36 +8056,36 @@
         <w:pStyle w:val="Compact"/>
       </w:pPr>
       <w:r>
-        <w:t xml:space="preserve">Click</w:t>
-      </w:r>
-      <w:r>
-        <w:t xml:space="preserve"> </w:t>
-      </w:r>
-      <w:r>
-        <w:rPr>
-          <w:bCs/>
-          <w:b/>
-        </w:rPr>
-        <w:t xml:space="preserve">Check against Dataverse…</w:t>
-      </w:r>
-      <w:r>
-        <w:t xml:space="preserve"> </w:t>
-      </w:r>
-      <w:r>
-        <w:t xml:space="preserve">on the Overview, or</w:t>
-      </w:r>
-      <w:r>
-        <w:t xml:space="preserve"> </w:t>
-      </w:r>
-      <w:r>
-        <w:rPr>
-          <w:bCs/>
-          <w:b/>
-        </w:rPr>
-        <w:t xml:space="preserve">More ▾ → Dataverse check</w:t>
-      </w:r>
-      <w:r>
-        <w:t xml:space="preserve">.</w:t>
+        <w:t xml:space="preserve">In Power Apps, open</w:t>
+      </w:r>
+      <w:r>
+        <w:t xml:space="preserve"> </w:t>
+      </w:r>
+      <w:r>
+        <w:rPr>
+          <w:bCs/>
+          <w:b/>
+        </w:rPr>
+        <w:t xml:space="preserve">Solutions</w:t>
+      </w:r>
+      <w:r>
+        <w:t xml:space="preserve">, select the solution and choose</w:t>
+      </w:r>
+      <w:r>
+        <w:t xml:space="preserve"> </w:t>
+      </w:r>
+      <w:r>
+        <w:rPr>
+          <w:bCs/>
+          <w:b/>
+        </w:rPr>
+        <w:t xml:space="preserve">Export</w:t>
+      </w:r>
+      <w:r>
+        <w:t xml:space="preserve"> </w:t>
+      </w:r>
+      <w:r>
+        <w:t xml:space="preserve">(managed or unmanaged).</w:t>
       </w:r>
     </w:p>
     <w:p>
@@ -7864,32 +8097,36 @@
         <w:pStyle w:val="Compact"/>
       </w:pPr>
       <w:r>
-        <w:t xml:space="preserve">Enter the</w:t>
-      </w:r>
-      <w:r>
-        <w:t xml:space="preserve"> </w:t>
-      </w:r>
-      <w:r>
-        <w:rPr>
-          <w:bCs/>
-          <w:b/>
-        </w:rPr>
-        <w:t xml:space="preserve">environment URL</w:t>
-      </w:r>
-      <w:r>
-        <w:t xml:space="preserve">, for example</w:t>
-      </w:r>
-      <w:r>
-        <w:t xml:space="preserve"> </w:t>
-      </w:r>
-      <w:r>
-        <w:rPr>
-          <w:rStyle w:val="VerbatimChar"/>
-        </w:rPr>
-        <w:t xml:space="preserve">https://yourorg.crm11.dynamics.com</w:t>
-      </w:r>
-      <w:r>
-        <w:t xml:space="preserve">. The page builds one link per 20 tables.</w:t>
+        <w:t xml:space="preserve">Click</w:t>
+      </w:r>
+      <w:r>
+        <w:t xml:space="preserve"> </w:t>
+      </w:r>
+      <w:r>
+        <w:rPr>
+          <w:bCs/>
+          <w:b/>
+        </w:rPr>
+        <w:t xml:space="preserve">Compare with a solution…</w:t>
+      </w:r>
+      <w:r>
+        <w:t xml:space="preserve"> </w:t>
+      </w:r>
+      <w:r>
+        <w:t xml:space="preserve">on the Overview, or</w:t>
+      </w:r>
+      <w:r>
+        <w:t xml:space="preserve"> </w:t>
+      </w:r>
+      <w:r>
+        <w:rPr>
+          <w:bCs/>
+          <w:b/>
+        </w:rPr>
+        <w:t xml:space="preserve">More ▾ → Compare with a solution…</w:t>
+      </w:r>
+      <w:r>
+        <w:t xml:space="preserve">.</w:t>
       </w:r>
     </w:p>
     <w:p>
@@ -7901,40 +8138,39 @@
         <w:pStyle w:val="Compact"/>
       </w:pPr>
       <w:r>
-        <w:t xml:space="preserve">Open each link in the browser where you are signed in to Dataverse, and save the page (</w:t>
-      </w:r>
-      <w:r>
-        <w:rPr>
-          <w:rStyle w:val="VerbatimChar"/>
-        </w:rPr>
-        <w:t xml:space="preserve">Ctrl</w:t>
-      </w:r>
-      <w:r>
-        <w:t xml:space="preserve">+</w:t>
-      </w:r>
-      <w:r>
-        <w:rPr>
-          <w:rStyle w:val="VerbatimChar"/>
-        </w:rPr>
-        <w:t xml:space="preserve">S</w:t>
-      </w:r>
-      <w:r>
-        <w:t xml:space="preserve">) as a</w:t>
-      </w:r>
-      <w:r>
-        <w:t xml:space="preserve"> </w:t>
-      </w:r>
-      <w:r>
-        <w:rPr>
-          <w:rStyle w:val="VerbatimChar"/>
-        </w:rPr>
-        <w:t xml:space="preserve">.json</w:t>
-      </w:r>
-      <w:r>
-        <w:t xml:space="preserve"> </w:t>
-      </w:r>
-      <w:r>
-        <w:t xml:space="preserve">file.</w:t>
+        <w:t xml:space="preserve">Click</w:t>
+      </w:r>
+      <w:r>
+        <w:t xml:space="preserve"> </w:t>
+      </w:r>
+      <w:r>
+        <w:rPr>
+          <w:bCs/>
+          <w:b/>
+        </w:rPr>
+        <w:t xml:space="preserve">Add a solution (.zip)…</w:t>
+      </w:r>
+      <w:r>
+        <w:t xml:space="preserve"> </w:t>
+      </w:r>
+      <w:r>
+        <w:t xml:space="preserve">and pick the exported file, or drop it onto the page. Several can be added at once; a solution built with</w:t>
+      </w:r>
+      <w:r>
+        <w:t xml:space="preserve"> </w:t>
+      </w:r>
+      <w:r>
+        <w:rPr>
+          <w:bCs/>
+          <w:b/>
+        </w:rPr>
+        <w:t xml:space="preserve">Build solution</w:t>
+      </w:r>
+      <w:r>
+        <w:t xml:space="preserve"> </w:t>
+      </w:r>
+      <w:r>
+        <w:t xml:space="preserve">works too.</w:t>
       </w:r>
     </w:p>
     <w:p>
@@ -7956,34 +8192,6 @@
           <w:bCs/>
           <w:b/>
         </w:rPr>
-        <w:t xml:space="preserve">Choose JSON files…</w:t>
-      </w:r>
-      <w:r>
-        <w:t xml:space="preserve"> </w:t>
-      </w:r>
-      <w:r>
-        <w:t xml:space="preserve">(or drop them onto the page). You can load several, and add more later.</w:t>
-      </w:r>
-    </w:p>
-    <w:p>
-      <w:pPr>
-        <w:numPr>
-          <w:ilvl w:val="0"/>
-          <w:numId w:val="1018"/>
-        </w:numPr>
-        <w:pStyle w:val="Compact"/>
-      </w:pPr>
-      <w:r>
-        <w:t xml:space="preserve">Click</w:t>
-      </w:r>
-      <w:r>
-        <w:t xml:space="preserve"> </w:t>
-      </w:r>
-      <w:r>
-        <w:rPr>
-          <w:bCs/>
-          <w:b/>
-        </w:rPr>
         <w:t xml:space="preserve">See the differences</w:t>
       </w:r>
       <w:r>
@@ -8000,7 +8208,7 @@
         <w:t xml:space="preserve">Checks</w:t>
       </w:r>
       <w:r>
-        <w:t xml:space="preserve">, and each table page shows what Dataverse has.</w:t>
+        <w:t xml:space="preserve">, and each table page shows what the solution has.</w:t>
       </w:r>
     </w:p>
     <w:p>
@@ -8010,9 +8218,9 @@
       <w:r>
         <w:drawing>
           <wp:inline>
-            <wp:extent cx="3264407" cy="2777182"/>
+            <wp:extent cx="3264407" cy="3361853"/>
             <wp:effectExtent b="0" l="0" r="0" t="0"/>
-            <wp:docPr descr="The Dataverse check panel" title="" id="104" name="Picture"/>
+            <wp:docPr descr="The Dataverse panel" title="" id="104" name="Picture"/>
             <a:graphic>
               <a:graphicData uri="http://schemas.openxmlformats.org/drawingml/2006/picture">
                 <pic:pic>
@@ -8031,7 +8239,7 @@
                   <pic:spPr bwMode="auto">
                     <a:xfrm>
                       <a:off x="0" y="0"/>
-                      <a:ext cx="3264407" cy="2777182"/>
+                      <a:ext cx="3264407" cy="3361853"/>
                     </a:xfrm>
                     <a:prstGeom prst="rect">
                       <a:avLst/>
@@ -8055,7 +8263,7 @@
         <w:pStyle w:val="ImageCaption"/>
       </w:pPr>
       <w:r>
-        <w:t xml:space="preserve">The Dataverse check panel</w:t>
+        <w:t xml:space="preserve">The Dataverse panel</w:t>
       </w:r>
     </w:p>
     <w:p>
@@ -8073,7 +8281,7 @@
         <w:t xml:space="preserve"> </w:t>
       </w:r>
       <w:r>
-        <w:t xml:space="preserve">Environment URL ·</w:t>
+        <w:t xml:space="preserve">Add a solution (.zip)… ·</w:t>
       </w:r>
       <w:r>
         <w:t xml:space="preserve"> </w:t>
@@ -8089,23 +8297,7 @@
         <w:t xml:space="preserve"> </w:t>
       </w:r>
       <w:r>
-        <w:t xml:space="preserve">Open each link ·</w:t>
-      </w:r>
-      <w:r>
-        <w:t xml:space="preserve"> </w:t>
-      </w:r>
-      <w:r>
-        <w:rPr>
-          <w:bCs/>
-          <w:b/>
-        </w:rPr>
-        <w:t xml:space="preserve">3</w:t>
-      </w:r>
-      <w:r>
-        <w:t xml:space="preserve"> </w:t>
-      </w:r>
-      <w:r>
-        <w:t xml:space="preserve">Choose JSON files…</w:t>
+        <w:t xml:space="preserve">How to export one from Power Apps</w:t>
       </w:r>
     </w:p>
     <w:p>
@@ -8113,17 +8305,17 @@
         <w:pStyle w:val="BodyText"/>
       </w:pPr>
       <w:r>
-        <w:t xml:space="preserve">If Dataverse rejects a link (usually a very long one), use the one-link-per-table list instead. The metadata is kept in the browser for this workbook;</w:t>
-      </w:r>
-      <w:r>
-        <w:t xml:space="preserve"> </w:t>
-      </w:r>
-      <w:r>
-        <w:rPr>
-          <w:bCs/>
-          <w:b/>
-        </w:rPr>
-        <w:t xml:space="preserve">Remove imported metadata</w:t>
+        <w:t xml:space="preserve">Only your own tables are expected in the solution: a standard table such as Account that it doesn’t hold is not flagged. A table included in the solution as a shell (only the columns you added) is compared on those columns, so its other standard columns are not reported missing. The comparison is kept in the browser for this workbook;</w:t>
+      </w:r>
+      <w:r>
+        <w:t xml:space="preserve"> </w:t>
+      </w:r>
+      <w:r>
+        <w:rPr>
+          <w:bCs/>
+          <w:b/>
+        </w:rPr>
+        <w:t xml:space="preserve">Remove</w:t>
       </w:r>
       <w:r>
         <w:t xml:space="preserve"> </w:t>
@@ -8201,19 +8393,19 @@
               <w:jc w:val="left"/>
             </w:pPr>
             <w:r>
-              <w:t xml:space="preserve">Field not in Dataverse; relationship not in Dataverse</w:t>
-            </w:r>
-          </w:p>
-        </w:tc>
-        <w:tc>
-          <w:tcPr/>
-          <w:p>
-            <w:pPr>
-              <w:pStyle w:val="Compact"/>
-              <w:jc w:val="left"/>
-            </w:pPr>
-            <w:r>
-              <w:t xml:space="preserve">The workbook has it, the environment doesn’t (yet)</w:t>
+              <w:t xml:space="preserve">Field not in Dataverse</w:t>
+            </w:r>
+          </w:p>
+        </w:tc>
+        <w:tc>
+          <w:tcPr/>
+          <w:p>
+            <w:pPr>
+              <w:pStyle w:val="Compact"/>
+              <w:jc w:val="left"/>
+            </w:pPr>
+            <w:r>
+              <w:t xml:space="preserve">The workbook has it, the solution doesn’t (yet)</w:t>
             </w:r>
           </w:p>
         </w:tc>
@@ -8239,7 +8431,7 @@
               <w:jc w:val="left"/>
             </w:pPr>
             <w:r>
-              <w:t xml:space="preserve">Workbook and environment disagree</w:t>
+              <w:t xml:space="preserve">Workbook and solution disagree</w:t>
             </w:r>
           </w:p>
         </w:tc>
@@ -8253,19 +8445,19 @@
               <w:jc w:val="left"/>
             </w:pPr>
             <w:r>
-              <w:t xml:space="preserve">Dataverse relationship not documented; custom Dataverse field not documented</w:t>
-            </w:r>
-          </w:p>
-        </w:tc>
-        <w:tc>
-          <w:tcPr/>
-          <w:p>
-            <w:pPr>
-              <w:pStyle w:val="Compact"/>
-              <w:jc w:val="left"/>
-            </w:pPr>
-            <w:r>
-              <w:t xml:space="preserve">The environment has it, the workbook doesn’t</w:t>
+              <w:t xml:space="preserve">Dataverse relationship not documented; custom Dataverse field not documented; table in the solution but not documented</w:t>
+            </w:r>
+          </w:p>
+        </w:tc>
+        <w:tc>
+          <w:tcPr/>
+          <w:p>
+            <w:pPr>
+              <w:pStyle w:val="Compact"/>
+              <w:jc w:val="left"/>
+            </w:pPr>
+            <w:r>
+              <w:t xml:space="preserve">The solution has it, the workbook doesn’t</w:t>
             </w:r>
           </w:p>
         </w:tc>
@@ -8291,20 +8483,20 @@
               <w:jc w:val="left"/>
             </w:pPr>
             <w:r>
-              <w:t xml:space="preserve">No definition loaded for that table</w:t>
+              <w:t xml:space="preserve">One of your tables is not in the solution</w:t>
             </w:r>
           </w:p>
         </w:tc>
       </w:tr>
     </w:tbl>
     <w:bookmarkEnd w:id="106"/>
-    <w:bookmarkStart w:id="110" w:name="generating-a-dataverse-solution"/>
+    <w:bookmarkStart w:id="107" w:name="publishers-and-prefixes"/>
     <w:p>
       <w:pPr>
         <w:pStyle w:val="Heading2"/>
       </w:pPr>
       <w:r>
-        <w:t xml:space="preserve">Generating a Dataverse solution</w:t>
+        <w:t xml:space="preserve">Publishers and prefixes</w:t>
       </w:r>
     </w:p>
     <w:p>
@@ -8316,29 +8508,52 @@
           <w:bCs/>
           <w:b/>
         </w:rPr>
-        <w:t xml:space="preserve">Export → Dataverse solution (.zip)…</w:t>
-      </w:r>
-      <w:r>
-        <w:t xml:space="preserve"> </w:t>
-      </w:r>
-      <w:r>
-        <w:t xml:space="preserve">(or</w:t>
-      </w:r>
-      <w:r>
-        <w:t xml:space="preserve"> </w:t>
-      </w:r>
-      <w:r>
-        <w:rPr>
-          <w:bCs/>
-          <w:b/>
-        </w:rPr>
-        <w:t xml:space="preserve">Build solution…</w:t>
-      </w:r>
-      <w:r>
-        <w:t xml:space="preserve"> </w:t>
-      </w:r>
-      <w:r>
-        <w:t xml:space="preserve">on the Overview) turns the workbook into an unmanaged solution, so nothing is created by hand in Power Apps. Clear the errors in Checks first.</w:t>
+        <w:t xml:space="preserve">More ▾ → Publishers and prefixes</w:t>
+      </w:r>
+      <w:r>
+        <w:t xml:space="preserve"> </w:t>
+      </w:r>
+      <w:r>
+        <w:t xml:space="preserve">lists your customisation prefixes and the publisher each belongs to: the prefix (for example</w:t>
+      </w:r>
+      <w:r>
+        <w:t xml:space="preserve"> </w:t>
+      </w:r>
+      <w:r>
+        <w:rPr>
+          <w:rStyle w:val="VerbatimChar"/>
+        </w:rPr>
+        <w:t xml:space="preserve">cxp</w:t>
+      </w:r>
+      <w:r>
+        <w:t xml:space="preserve">,</w:t>
+      </w:r>
+      <w:r>
+        <w:t xml:space="preserve"> </w:t>
+      </w:r>
+      <w:r>
+        <w:rPr>
+          <w:rStyle w:val="VerbatimChar"/>
+        </w:rPr>
+        <w:t xml:space="preserve">ax</w:t>
+      </w:r>
+      <w:r>
+        <w:t xml:space="preserve"> </w:t>
+      </w:r>
+      <w:r>
+        <w:t xml:space="preserve">or</w:t>
+      </w:r>
+      <w:r>
+        <w:t xml:space="preserve"> </w:t>
+      </w:r>
+      <w:r>
+        <w:rPr>
+          <w:rStyle w:val="VerbatimChar"/>
+        </w:rPr>
+        <w:t xml:space="preserve">portal</w:t>
+      </w:r>
+      <w:r>
+        <w:t xml:space="preserve">), the publisher’s unique name, its display name and its choice value prefix. They are kept in this browser for every workbook.</w:t>
       </w:r>
     </w:p>
     <w:p>
@@ -8350,49 +8565,17 @@
         <w:pStyle w:val="Compact"/>
       </w:pPr>
       <w:r>
-        <w:t xml:space="preserve">Choose</w:t>
-      </w:r>
-      <w:r>
-        <w:t xml:space="preserve"> </w:t>
-      </w:r>
-      <w:r>
-        <w:rPr>
-          <w:bCs/>
-          <w:b/>
-        </w:rPr>
-        <w:t xml:space="preserve">What to build</w:t>
-      </w:r>
-      <w:r>
-        <w:t xml:space="preserve">:</w:t>
-      </w:r>
-      <w:r>
-        <w:t xml:space="preserve"> </w:t>
-      </w:r>
-      <w:r>
-        <w:rPr>
-          <w:bCs/>
-          <w:b/>
-        </w:rPr>
-        <w:t xml:space="preserve">Tables, fields and relationships</w:t>
-      </w:r>
-      <w:r>
-        <w:t xml:space="preserve"> </w:t>
-      </w:r>
-      <w:r>
-        <w:t xml:space="preserve">(everything with your prefix), or</w:t>
-      </w:r>
-      <w:r>
-        <w:t xml:space="preserve"> </w:t>
-      </w:r>
-      <w:r>
-        <w:rPr>
-          <w:bCs/>
-          <w:b/>
-        </w:rPr>
-        <w:t xml:space="preserve">Tables only</w:t>
-      </w:r>
-      <w:r>
-        <w:t xml:space="preserve">, which builds each new table with just its primary name column, for when you want the tables in place first and the fields later. The choice is remembered for the workbook.</w:t>
+        <w:rPr>
+          <w:bCs/>
+          <w:b/>
+        </w:rPr>
+        <w:t xml:space="preserve">Checks</w:t>
+      </w:r>
+      <w:r>
+        <w:t xml:space="preserve"> </w:t>
+      </w:r>
+      <w:r>
+        <w:t xml:space="preserve">count a field as yours when it starts with one of your prefixes, and flag a custom field whose prefix is neither yours nor Microsoft’s.</w:t>
       </w:r>
     </w:p>
     <w:p>
@@ -8404,7 +8587,17 @@
         <w:pStyle w:val="Compact"/>
       </w:pPr>
       <w:r>
-        <w:t xml:space="preserve">Fill in the rest of the dialog. The prefix and choice value prefix are suggested from the workbook.</w:t>
+        <w:rPr>
+          <w:bCs/>
+          <w:b/>
+        </w:rPr>
+        <w:t xml:space="preserve">＋ Add field</w:t>
+      </w:r>
+      <w:r>
+        <w:t xml:space="preserve"> </w:t>
+      </w:r>
+      <w:r>
+        <w:t xml:space="preserve">gives a new field the table’s own prefix, or your usual one.</w:t>
       </w:r>
     </w:p>
     <w:p>
@@ -8416,20 +8609,17 @@
         <w:pStyle w:val="Compact"/>
       </w:pPr>
       <w:r>
-        <w:t xml:space="preserve">Read</w:t>
-      </w:r>
-      <w:r>
-        <w:t xml:space="preserve"> </w:t>
-      </w:r>
-      <w:r>
-        <w:rPr>
-          <w:bCs/>
-          <w:b/>
-        </w:rPr>
-        <w:t xml:space="preserve">Will be built</w:t>
-      </w:r>
-      <w:r>
-        <w:t xml:space="preserve">: new tables, existing tables gaining your fields, fields and relationships, plus what is to build by hand or not included and why.</w:t>
+        <w:rPr>
+          <w:bCs/>
+          <w:b/>
+        </w:rPr>
+        <w:t xml:space="preserve">Build solution</w:t>
+      </w:r>
+      <w:r>
+        <w:t xml:space="preserve"> </w:t>
+      </w:r>
+      <w:r>
+        <w:t xml:space="preserve">suggests your prefixes in its Prefix box and fills in that prefix’s publisher. Building with a new prefix adds it to the list.</w:t>
       </w:r>
     </w:p>
     <w:p>
@@ -8441,6 +8631,272 @@
         <w:pStyle w:val="Compact"/>
       </w:pPr>
       <w:r>
+        <w:rPr>
+          <w:bCs/>
+          <w:b/>
+        </w:rPr>
+        <w:t xml:space="preserve">Microsoft and other vendors’ prefixes</w:t>
+      </w:r>
+      <w:r>
+        <w:t xml:space="preserve"> </w:t>
+      </w:r>
+      <w:r>
+        <w:t xml:space="preserve">are treated as out of the box. The default is</w:t>
+      </w:r>
+      <w:r>
+        <w:t xml:space="preserve"> </w:t>
+      </w:r>
+      <w:r>
+        <w:rPr>
+          <w:rStyle w:val="VerbatimChar"/>
+        </w:rPr>
+        <w:t xml:space="preserve">ms*, adx</w:t>
+      </w:r>
+      <w:r>
+        <w:t xml:space="preserve">: an entry ending in</w:t>
+      </w:r>
+      <w:r>
+        <w:t xml:space="preserve"> </w:t>
+      </w:r>
+      <w:r>
+        <w:rPr>
+          <w:rStyle w:val="VerbatimChar"/>
+        </w:rPr>
+        <w:t xml:space="preserve">*</w:t>
+      </w:r>
+      <w:r>
+        <w:t xml:space="preserve"> </w:t>
+      </w:r>
+      <w:r>
+        <w:t xml:space="preserve">matches every prefix that starts with it, so</w:t>
+      </w:r>
+      <w:r>
+        <w:t xml:space="preserve"> </w:t>
+      </w:r>
+      <w:r>
+        <w:rPr>
+          <w:rStyle w:val="VerbatimChar"/>
+        </w:rPr>
+        <w:t xml:space="preserve">ms*</w:t>
+      </w:r>
+      <w:r>
+        <w:t xml:space="preserve"> </w:t>
+      </w:r>
+      <w:r>
+        <w:t xml:space="preserve">covers</w:t>
+      </w:r>
+      <w:r>
+        <w:t xml:space="preserve"> </w:t>
+      </w:r>
+      <w:r>
+        <w:rPr>
+          <w:rStyle w:val="VerbatimChar"/>
+        </w:rPr>
+        <w:t xml:space="preserve">msdyn</w:t>
+      </w:r>
+      <w:r>
+        <w:t xml:space="preserve">,</w:t>
+      </w:r>
+      <w:r>
+        <w:t xml:space="preserve"> </w:t>
+      </w:r>
+      <w:r>
+        <w:rPr>
+          <w:rStyle w:val="VerbatimChar"/>
+        </w:rPr>
+        <w:t xml:space="preserve">mspp</w:t>
+      </w:r>
+      <w:r>
+        <w:t xml:space="preserve">,</w:t>
+      </w:r>
+      <w:r>
+        <w:t xml:space="preserve"> </w:t>
+      </w:r>
+      <w:r>
+        <w:rPr>
+          <w:rStyle w:val="VerbatimChar"/>
+        </w:rPr>
+        <w:t xml:space="preserve">msdynce</w:t>
+      </w:r>
+      <w:r>
+        <w:t xml:space="preserve"> </w:t>
+      </w:r>
+      <w:r>
+        <w:t xml:space="preserve">and the rest. Add any others you use, such as a partner’s.</w:t>
+      </w:r>
+    </w:p>
+    <w:p>
+      <w:pPr>
+        <w:numPr>
+          <w:ilvl w:val="0"/>
+          <w:numId w:val="1019"/>
+        </w:numPr>
+        <w:pStyle w:val="Compact"/>
+      </w:pPr>
+      <w:r>
+        <w:t xml:space="preserve">Prefixes used in the workbook that are not listed appear under the table, to add with one click.</w:t>
+      </w:r>
+      <w:r>
+        <w:t xml:space="preserve"> </w:t>
+      </w:r>
+      <w:r>
+        <w:rPr>
+          <w:bCs/>
+          <w:b/>
+        </w:rPr>
+        <w:t xml:space="preserve">Reset</w:t>
+      </w:r>
+      <w:r>
+        <w:t xml:space="preserve"> </w:t>
+      </w:r>
+      <w:r>
+        <w:t xml:space="preserve">goes back to guessing your prefixes from the custom tables, as before.</w:t>
+      </w:r>
+    </w:p>
+    <w:bookmarkEnd w:id="107"/>
+    <w:bookmarkStart w:id="111" w:name="generating-a-dataverse-solution"/>
+    <w:p>
+      <w:pPr>
+        <w:pStyle w:val="Heading2"/>
+      </w:pPr>
+      <w:r>
+        <w:t xml:space="preserve">Generating a Dataverse solution</w:t>
+      </w:r>
+    </w:p>
+    <w:p>
+      <w:pPr>
+        <w:pStyle w:val="FirstParagraph"/>
+      </w:pPr>
+      <w:r>
+        <w:rPr>
+          <w:bCs/>
+          <w:b/>
+        </w:rPr>
+        <w:t xml:space="preserve">Export → Dataverse solution (.zip)…</w:t>
+      </w:r>
+      <w:r>
+        <w:t xml:space="preserve"> </w:t>
+      </w:r>
+      <w:r>
+        <w:t xml:space="preserve">(or</w:t>
+      </w:r>
+      <w:r>
+        <w:t xml:space="preserve"> </w:t>
+      </w:r>
+      <w:r>
+        <w:rPr>
+          <w:bCs/>
+          <w:b/>
+        </w:rPr>
+        <w:t xml:space="preserve">Build solution…</w:t>
+      </w:r>
+      <w:r>
+        <w:t xml:space="preserve"> </w:t>
+      </w:r>
+      <w:r>
+        <w:t xml:space="preserve">on the Overview) turns the workbook into an unmanaged solution, so nothing is created by hand in Power Apps. Clear the errors in Checks first.</w:t>
+      </w:r>
+    </w:p>
+    <w:p>
+      <w:pPr>
+        <w:numPr>
+          <w:ilvl w:val="0"/>
+          <w:numId w:val="1020"/>
+        </w:numPr>
+        <w:pStyle w:val="Compact"/>
+      </w:pPr>
+      <w:r>
+        <w:t xml:space="preserve">Choose</w:t>
+      </w:r>
+      <w:r>
+        <w:t xml:space="preserve"> </w:t>
+      </w:r>
+      <w:r>
+        <w:rPr>
+          <w:bCs/>
+          <w:b/>
+        </w:rPr>
+        <w:t xml:space="preserve">What to build</w:t>
+      </w:r>
+      <w:r>
+        <w:t xml:space="preserve">:</w:t>
+      </w:r>
+      <w:r>
+        <w:t xml:space="preserve"> </w:t>
+      </w:r>
+      <w:r>
+        <w:rPr>
+          <w:bCs/>
+          <w:b/>
+        </w:rPr>
+        <w:t xml:space="preserve">Tables, fields and relationships</w:t>
+      </w:r>
+      <w:r>
+        <w:t xml:space="preserve"> </w:t>
+      </w:r>
+      <w:r>
+        <w:t xml:space="preserve">(everything with your prefix), or</w:t>
+      </w:r>
+      <w:r>
+        <w:t xml:space="preserve"> </w:t>
+      </w:r>
+      <w:r>
+        <w:rPr>
+          <w:bCs/>
+          <w:b/>
+        </w:rPr>
+        <w:t xml:space="preserve">Tables only</w:t>
+      </w:r>
+      <w:r>
+        <w:t xml:space="preserve">, which builds each new table with just its primary name column, for when you want the tables in place first and the fields later. The choice is remembered for the workbook.</w:t>
+      </w:r>
+    </w:p>
+    <w:p>
+      <w:pPr>
+        <w:numPr>
+          <w:ilvl w:val="0"/>
+          <w:numId w:val="1020"/>
+        </w:numPr>
+        <w:pStyle w:val="Compact"/>
+      </w:pPr>
+      <w:r>
+        <w:t xml:space="preserve">Fill in the rest of the dialog. The prefix and choice value prefix are suggested from the workbook.</w:t>
+      </w:r>
+    </w:p>
+    <w:p>
+      <w:pPr>
+        <w:numPr>
+          <w:ilvl w:val="0"/>
+          <w:numId w:val="1020"/>
+        </w:numPr>
+        <w:pStyle w:val="Compact"/>
+      </w:pPr>
+      <w:r>
+        <w:t xml:space="preserve">Read</w:t>
+      </w:r>
+      <w:r>
+        <w:t xml:space="preserve"> </w:t>
+      </w:r>
+      <w:r>
+        <w:rPr>
+          <w:bCs/>
+          <w:b/>
+        </w:rPr>
+        <w:t xml:space="preserve">Will be built</w:t>
+      </w:r>
+      <w:r>
+        <w:t xml:space="preserve">: new tables, existing tables gaining your fields, fields and relationships, plus what is to build by hand or not included and why.</w:t>
+      </w:r>
+    </w:p>
+    <w:p>
+      <w:pPr>
+        <w:numPr>
+          <w:ilvl w:val="0"/>
+          <w:numId w:val="1020"/>
+        </w:numPr>
+        <w:pStyle w:val="Compact"/>
+      </w:pPr>
+      <w:r>
         <w:t xml:space="preserve">Click</w:t>
       </w:r>
       <w:r>
@@ -8478,18 +8934,18 @@
           <wp:inline>
             <wp:extent cx="4828032" cy="4291584"/>
             <wp:effectExtent b="0" l="0" r="0" t="0"/>
-            <wp:docPr descr="The Build a Dataverse solution dialog" title="" id="108" name="Picture"/>
+            <wp:docPr descr="The Build a Dataverse solution dialog" title="" id="109" name="Picture"/>
             <a:graphic>
               <a:graphicData uri="http://schemas.openxmlformats.org/drawingml/2006/picture">
                 <pic:pic>
                   <pic:nvPicPr>
-                    <pic:cNvPr descr="images/17-solution.png" id="109" name="Picture"/>
+                    <pic:cNvPr descr="images/17-solution.png" id="110" name="Picture"/>
                     <pic:cNvPicPr>
                       <a:picLocks noChangeArrowheads="1" noChangeAspect="1"/>
                     </pic:cNvPicPr>
                   </pic:nvPicPr>
                   <pic:blipFill>
-                    <a:blip r:embed="rId107"/>
+                    <a:blip r:embed="rId108"/>
                     <a:stretch>
                       <a:fillRect/>
                     </a:stretch>
@@ -8936,7 +9392,34 @@
         <w:t xml:space="preserve"> </w:t>
       </w:r>
       <w:r>
-        <w:t xml:space="preserve">(listed in the build report instead): calculated and rollup fields, activity tables, lookups to several tables, image and file fields, choice fields with no options, tables with no primary name column or a primary key that isn’t a unique identifier, forms and views.</w:t>
+        <w:t xml:space="preserve">(listed in the build report instead): calculated and rollup fields, prefixed copies of system fields (such as</w:t>
+      </w:r>
+      <w:r>
+        <w:t xml:space="preserve"> </w:t>
+      </w:r>
+      <w:r>
+        <w:rPr>
+          <w:rStyle w:val="VerbatimChar"/>
+        </w:rPr>
+        <w:t xml:space="preserve">fp_createdon</w:t>
+      </w:r>
+      <w:r>
+        <w:t xml:space="preserve">: Dataverse creates</w:t>
+      </w:r>
+      <w:r>
+        <w:t xml:space="preserve"> </w:t>
+      </w:r>
+      <w:r>
+        <w:rPr>
+          <w:rStyle w:val="VerbatimChar"/>
+        </w:rPr>
+        <w:t xml:space="preserve">createdon</w:t>
+      </w:r>
+      <w:r>
+        <w:t xml:space="preserve"> </w:t>
+      </w:r>
+      <w:r>
+        <w:t xml:space="preserve">on every table), activity tables, lookups to several tables, image and file fields, choice fields with no options, tables with no primary name column or a primary key that isn’t a unique identifier, forms and views.</w:t>
       </w:r>
     </w:p>
     <w:tbl>
@@ -9145,8 +9628,8 @@
         </w:tc>
       </w:tr>
     </w:tbl>
-    <w:bookmarkEnd w:id="110"/>
-    <w:bookmarkStart w:id="111" w:name="importing-the-solution"/>
+    <w:bookmarkEnd w:id="111"/>
+    <w:bookmarkStart w:id="112" w:name="importing-the-solution"/>
     <w:p>
       <w:pPr>
         <w:pStyle w:val="Heading2"/>
@@ -9183,7 +9666,7 @@
       <w:pPr>
         <w:numPr>
           <w:ilvl w:val="0"/>
-          <w:numId w:val="1020"/>
+          <w:numId w:val="1021"/>
         </w:numPr>
       </w:pPr>
       <w:r>
@@ -9194,7 +9677,7 @@
       <w:pPr>
         <w:numPr>
           <w:ilvl w:val="0"/>
-          <w:numId w:val="1020"/>
+          <w:numId w:val="1021"/>
         </w:numPr>
       </w:pPr>
       <w:r>
@@ -9304,7 +9787,7 @@
       <w:pPr>
         <w:numPr>
           <w:ilvl w:val="0"/>
-          <w:numId w:val="1020"/>
+          <w:numId w:val="1021"/>
         </w:numPr>
       </w:pPr>
       <w:r>
@@ -9324,7 +9807,7 @@
       <w:pPr>
         <w:numPr>
           <w:ilvl w:val="0"/>
-          <w:numId w:val="1020"/>
+          <w:numId w:val="1021"/>
         </w:numPr>
       </w:pPr>
       <w:r>
@@ -9335,7 +9818,7 @@
       <w:pPr>
         <w:numPr>
           <w:ilvl w:val="0"/>
-          <w:numId w:val="1020"/>
+          <w:numId w:val="1021"/>
         </w:numPr>
       </w:pPr>
       <w:r>
@@ -9515,8 +9998,8 @@
         <w:t xml:space="preserve">downloads the script on its own, to import a solution zip you already have.</w:t>
       </w:r>
     </w:p>
-    <w:bookmarkEnd w:id="111"/>
-    <w:bookmarkStart w:id="112" w:name="after-the-import"/>
+    <w:bookmarkEnd w:id="112"/>
+    <w:bookmarkStart w:id="113" w:name="after-the-import"/>
     <w:p>
       <w:pPr>
         <w:pStyle w:val="Heading2"/>
@@ -9529,7 +10012,7 @@
       <w:pPr>
         <w:numPr>
           <w:ilvl w:val="0"/>
-          <w:numId w:val="1021"/>
+          <w:numId w:val="1022"/>
         </w:numPr>
         <w:pStyle w:val="Compact"/>
       </w:pPr>
@@ -9569,7 +10052,7 @@
       <w:pPr>
         <w:numPr>
           <w:ilvl w:val="0"/>
-          <w:numId w:val="1021"/>
+          <w:numId w:val="1022"/>
         </w:numPr>
         <w:pStyle w:val="Compact"/>
       </w:pPr>
@@ -9596,7 +10079,7 @@
       <w:pPr>
         <w:numPr>
           <w:ilvl w:val="0"/>
-          <w:numId w:val="1021"/>
+          <w:numId w:val="1022"/>
         </w:numPr>
         <w:pStyle w:val="Compact"/>
       </w:pPr>
@@ -9624,7 +10107,7 @@
       <w:pPr>
         <w:numPr>
           <w:ilvl w:val="0"/>
-          <w:numId w:val="1021"/>
+          <w:numId w:val="1022"/>
         </w:numPr>
         <w:pStyle w:val="Compact"/>
       </w:pPr>
@@ -9636,19 +10119,19 @@
       <w:pPr>
         <w:numPr>
           <w:ilvl w:val="0"/>
-          <w:numId w:val="1021"/>
+          <w:numId w:val="1022"/>
         </w:numPr>
         <w:pStyle w:val="Compact"/>
       </w:pPr>
       <w:r>
-        <w:t xml:space="preserve">Optionally, compare the workbook with the environment (Comparing with Dataverse) to confirm everything landed.</w:t>
+        <w:t xml:space="preserve">Optionally, compare the workbook with the environment (Comparing with a solution) to confirm everything landed.</w:t>
       </w:r>
     </w:p>
     <w:p>
       <w:pPr>
         <w:numPr>
           <w:ilvl w:val="0"/>
-          <w:numId w:val="1021"/>
+          <w:numId w:val="1022"/>
         </w:numPr>
         <w:pStyle w:val="Compact"/>
       </w:pPr>
@@ -9672,8 +10155,8 @@
         <w:t xml:space="preserve">for test and production.</w:t>
       </w:r>
     </w:p>
-    <w:bookmarkEnd w:id="112"/>
-    <w:bookmarkStart w:id="113" w:name="troubleshooting-and-faq"/>
+    <w:bookmarkEnd w:id="113"/>
+    <w:bookmarkStart w:id="114" w:name="troubleshooting-and-faq"/>
     <w:p>
       <w:pPr>
         <w:pStyle w:val="Heading2"/>
@@ -9838,7 +10321,7 @@
               <w:jc w:val="left"/>
             </w:pPr>
             <w:r>
-              <w:t xml:space="preserve">Read the reason it gives. Usually there is no empty row for an added field before the Forms section, or a detail before the field list. Use</w:t>
+              <w:t xml:space="preserve">Read the reason it gives. Usually there is no empty row for an added field before the Forms section, or a sheet that rows can’t be inserted into (it holds an Excel table, a drawing or comments, or another sheet’s formula points at it). Use</w:t>
             </w:r>
             <w:r>
               <w:t xml:space="preserve"> </w:t>
@@ -10495,8 +10978,8 @@
         </w:tc>
       </w:tr>
     </w:tbl>
-    <w:bookmarkEnd w:id="113"/>
-    <w:bookmarkStart w:id="114" w:name="reference-the-workbook-layout"/>
+    <w:bookmarkEnd w:id="114"/>
+    <w:bookmarkStart w:id="115" w:name="reference-the-workbook-layout"/>
     <w:p>
       <w:pPr>
         <w:pStyle w:val="Heading2"/>
@@ -11462,7 +11945,7 @@
       <w:pPr>
         <w:numPr>
           <w:ilvl w:val="0"/>
-          <w:numId w:val="1022"/>
+          <w:numId w:val="1023"/>
         </w:numPr>
         <w:pStyle w:val="Compact"/>
       </w:pPr>
@@ -11498,7 +11981,7 @@
       <w:pPr>
         <w:numPr>
           <w:ilvl w:val="0"/>
-          <w:numId w:val="1022"/>
+          <w:numId w:val="1023"/>
         </w:numPr>
         <w:pStyle w:val="Compact"/>
       </w:pPr>
@@ -11543,7 +12026,7 @@
       <w:pPr>
         <w:numPr>
           <w:ilvl w:val="0"/>
-          <w:numId w:val="1022"/>
+          <w:numId w:val="1023"/>
         </w:numPr>
         <w:pStyle w:val="Compact"/>
       </w:pPr>
@@ -11579,7 +12062,7 @@
       <w:pPr>
         <w:numPr>
           <w:ilvl w:val="0"/>
-          <w:numId w:val="1022"/>
+          <w:numId w:val="1023"/>
         </w:numPr>
         <w:pStyle w:val="Compact"/>
       </w:pPr>
@@ -11624,7 +12107,7 @@
       <w:pPr>
         <w:numPr>
           <w:ilvl w:val="0"/>
-          <w:numId w:val="1022"/>
+          <w:numId w:val="1023"/>
         </w:numPr>
         <w:pStyle w:val="Compact"/>
       </w:pPr>
@@ -11687,7 +12170,7 @@
       <w:pPr>
         <w:numPr>
           <w:ilvl w:val="0"/>
-          <w:numId w:val="1022"/>
+          <w:numId w:val="1023"/>
         </w:numPr>
         <w:pStyle w:val="Compact"/>
       </w:pPr>
@@ -11824,6 +12307,39 @@
           <w:bCs/>
           <w:b/>
         </w:rPr>
+        <w:t xml:space="preserve">Sub-grids.</w:t>
+      </w:r>
+      <w:r>
+        <w:t xml:space="preserve"> </w:t>
+      </w:r>
+      <w:r>
+        <w:t xml:space="preserve">A row in the field list whose Attribute Type is</w:t>
+      </w:r>
+      <w:r>
+        <w:t xml:space="preserve"> </w:t>
+      </w:r>
+      <w:r>
+        <w:rPr>
+          <w:rStyle w:val="VerbatimChar"/>
+        </w:rPr>
+        <w:t xml:space="preserve">Sub grid</w:t>
+      </w:r>
+      <w:r>
+        <w:t xml:space="preserve"> </w:t>
+      </w:r>
+      <w:r>
+        <w:t xml:space="preserve">documents a sub-grid on a form. It needs no logical name, and it is not checked, counted as a field or built.</w:t>
+      </w:r>
+    </w:p>
+    <w:p>
+      <w:pPr>
+        <w:pStyle w:val="BodyText"/>
+      </w:pPr>
+      <w:r>
+        <w:rPr>
+          <w:bCs/>
+          <w:b/>
+        </w:rPr>
         <w:t xml:space="preserve">Older workbooks.</w:t>
       </w:r>
       <w:r>
@@ -11846,7 +12362,7 @@
         <w:t xml:space="preserve">, and written to the file with the first value you save in them. A column you add to the template’s header row is read, shown, filterable and editable too.</w:t>
       </w:r>
     </w:p>
-    <w:bookmarkEnd w:id="114"/>
+    <w:bookmarkEnd w:id="115"/>
     <w:sectPr/>
   </w:body>
 </w:document>
@@ -12442,34 +12958,7 @@
     </w:lvlOverride>
   </w:num>
   <w:num w:numId="1019">
-    <w:abstractNumId w:val="99411"/>
-    <w:lvlOverride w:ilvl="0">
-      <w:startOverride w:val="1"/>
-    </w:lvlOverride>
-    <w:lvlOverride w:ilvl="1">
-      <w:startOverride w:val="1"/>
-    </w:lvlOverride>
-    <w:lvlOverride w:ilvl="2">
-      <w:startOverride w:val="1"/>
-    </w:lvlOverride>
-    <w:lvlOverride w:ilvl="3">
-      <w:startOverride w:val="1"/>
-    </w:lvlOverride>
-    <w:lvlOverride w:ilvl="4">
-      <w:startOverride w:val="1"/>
-    </w:lvlOverride>
-    <w:lvlOverride w:ilvl="5">
-      <w:startOverride w:val="1"/>
-    </w:lvlOverride>
-    <w:lvlOverride w:ilvl="6">
-      <w:startOverride w:val="1"/>
-    </w:lvlOverride>
-    <w:lvlOverride w:ilvl="7">
-      <w:startOverride w:val="1"/>
-    </w:lvlOverride>
-    <w:lvlOverride w:ilvl="8">
-      <w:startOverride w:val="1"/>
-    </w:lvlOverride>
+    <w:abstractNumId w:val="991"/>
   </w:num>
   <w:num w:numId="1020">
     <w:abstractNumId w:val="99411"/>
@@ -12532,6 +13021,36 @@
     </w:lvlOverride>
   </w:num>
   <w:num w:numId="1022">
+    <w:abstractNumId w:val="99411"/>
+    <w:lvlOverride w:ilvl="0">
+      <w:startOverride w:val="1"/>
+    </w:lvlOverride>
+    <w:lvlOverride w:ilvl="1">
+      <w:startOverride w:val="1"/>
+    </w:lvlOverride>
+    <w:lvlOverride w:ilvl="2">
+      <w:startOverride w:val="1"/>
+    </w:lvlOverride>
+    <w:lvlOverride w:ilvl="3">
+      <w:startOverride w:val="1"/>
+    </w:lvlOverride>
+    <w:lvlOverride w:ilvl="4">
+      <w:startOverride w:val="1"/>
+    </w:lvlOverride>
+    <w:lvlOverride w:ilvl="5">
+      <w:startOverride w:val="1"/>
+    </w:lvlOverride>
+    <w:lvlOverride w:ilvl="6">
+      <w:startOverride w:val="1"/>
+    </w:lvlOverride>
+    <w:lvlOverride w:ilvl="7">
+      <w:startOverride w:val="1"/>
+    </w:lvlOverride>
+    <w:lvlOverride w:ilvl="8">
+      <w:startOverride w:val="1"/>
+    </w:lvlOverride>
+  </w:num>
+  <w:num w:numId="1023">
     <w:abstractNumId w:val="991"/>
   </w:num>
 </w:numbering>

</xml_diff>

<commit_message>
1.9.7, 2.0.7, 3.0.4, 4.0.4, 5.0.4: rebuilt pages, solution zips, guides and the XrmToolBox dll
- Data_Model_Explorer.html rebuilt in each (empty template embedded)
- FORMUS_DataModelExplorer_3_0_4_0, 4_0_4_0, 5_0_4_0 replace the 0_3_0 zips
- Word guides rebuilt (all)
- xrmtoolbox/release dll rebuilt as 5.0.4
- All suites pass: 305, 350, 406, 420, 420

Co-Authored-By: Claude Opus 5.5 <noreply@anthropic.com>
Claude-Session: https://claude.ai/code/session_01SKe3s5TvTWyeqUT38hd6Ss
</commit_message>
<xml_diff>
--- a/data-model-explorer-live/docs/User_Guide.docx
+++ b/data-model-explorer-live/docs/User_Guide.docx
@@ -5719,6 +5719,72 @@
       </w:r>
       <w:r>
         <w:t xml:space="preserve">instead.</w:t>
+      </w:r>
+    </w:p>
+    <w:p>
+      <w:pPr>
+        <w:pStyle w:val="BodyText"/>
+      </w:pPr>
+      <w:r>
+        <w:t xml:space="preserve">If the original file has been moved, renamed or deleted since you opened it,</w:t>
+      </w:r>
+      <w:r>
+        <w:t xml:space="preserve"> </w:t>
+      </w:r>
+      <w:r>
+        <w:rPr>
+          <w:bCs/>
+          <w:b/>
+        </w:rPr>
+        <w:t xml:space="preserve">Save back to the original file</w:t>
+      </w:r>
+      <w:r>
+        <w:t xml:space="preserve"> </w:t>
+      </w:r>
+      <w:r>
+        <w:t xml:space="preserve">says so and offers</w:t>
+      </w:r>
+      <w:r>
+        <w:t xml:space="preserve"> </w:t>
+      </w:r>
+      <w:r>
+        <w:rPr>
+          <w:bCs/>
+          <w:b/>
+        </w:rPr>
+        <w:t xml:space="preserve">Save as…</w:t>
+      </w:r>
+      <w:r>
+        <w:t xml:space="preserve">: pick a folder and a name, and the page saves there and links to that file from then on. To see which version of the page you are using, hover the</w:t>
+      </w:r>
+      <w:r>
+        <w:t xml:space="preserve"> </w:t>
+      </w:r>
+      <w:r>
+        <w:rPr>
+          <w:bCs/>
+          <w:b/>
+        </w:rPr>
+        <w:t xml:space="preserve">?</w:t>
+      </w:r>
+      <w:r>
+        <w:t xml:space="preserve"> </w:t>
+      </w:r>
+      <w:r>
+        <w:t xml:space="preserve">button or open</w:t>
+      </w:r>
+      <w:r>
+        <w:t xml:space="preserve"> </w:t>
+      </w:r>
+      <w:r>
+        <w:rPr>
+          <w:bCs/>
+          <w:b/>
+        </w:rPr>
+        <w:t xml:space="preserve">How it works</w:t>
+      </w:r>
+      <w:r>
+        <w:t xml:space="preserve">.</w:t>
       </w:r>
     </w:p>
     <w:p>

</xml_diff>

<commit_message>
Release 1.9.8, 2.0.8, 3.0.5, 4.0.5, 5.0.5 and 6.0.0: pages, solution zips, guides and XrmToolBox dlls
- Data_Model_Explorer.html rebuilt in each (empty template embedded)
- FORMUS_DataModelExplorer_3_0_5_0, 4_0_5_0, 5_0_5_0 replace the 0_4_0 zips; 6_0_0_0 holds five web resources
- The ERD filter's example uses your own prefix, not rhs_ (all versions)
- 5.0/6.0: Ctrl+S sits beside Save in the menu; guide screenshot of the menu retaken
- Word guides rebuilt (all); xrmtoolbox/release dlls rebuilt as 5.0.5 and 6.0.0
- All suites pass: 317, 362, 418, 436, 453, 475

Co-Authored-By: Claude Opus 5.5 <noreply@anthropic.com>
Claude-Session: https://claude.ai/code/session_01SKe3s5TvTWyeqUT38hd6Ss
</commit_message>
<xml_diff>
--- a/data-model-explorer-live/docs/User_Guide.docx
+++ b/data-model-explorer-live/docs/User_Guide.docx
@@ -5689,7 +5689,7 @@
         <w:pStyle w:val="BodyText"/>
       </w:pPr>
       <w:r>
-        <w:t xml:space="preserve">The first two only rewrite the cells you changed; formatting, validations and everything else stay byte for byte. Added rows go into the empty rows after the field list. A table detail the sheet doesn’t have yet (for example Primary Name Column or Primary Key) goes into an empty row above the field list or, when there is none, into a row inserted just below the last detail: everything underneath moves down with it, including merged cells, dropdown lists, conditional formatting, filters and the frozen header. The file is then read back and every edit checked. If any edit can’t be written (for example there is no empty row left before the Forms section, or the sheet has an Excel table, a drawing, comments, or a formula on another sheet pointing at it, so rows can’t be inserted),</w:t>
+        <w:t xml:space="preserve">The first two only rewrite the cells you changed; formatting, validations and everything else stay byte for byte. Added rows go into the empty rows after the field list. A table detail the sheet doesn’t have yet (for example Primary Name Column or Primary Key) goes into an empty row above the field list or, when there is none, into a row inserted just below the last detail: everything underneath moves down with it, including merged cells, dropdown lists, conditional formatting, filters and the frozen header, and anything elsewhere that points at those rows: named ranges, print titles, other sheets’ formulas and charts. The file is then read back and every edit checked. If any edit can’t be written (for example there is no empty row left before the Forms section, or the sheet has an Excel table, a drawing or comments, or a pivot table reads from it, so rows can’t be inserted),</w:t>
       </w:r>
       <w:r>
         <w:t xml:space="preserve"> </w:t>
@@ -10387,7 +10387,7 @@
               <w:jc w:val="left"/>
             </w:pPr>
             <w:r>
-              <w:t xml:space="preserve">Read the reason it gives. Usually there is no empty row for an added field before the Forms section, or a sheet that rows can’t be inserted into (it holds an Excel table, a drawing or comments, or another sheet’s formula points at it). Use</w:t>
+              <w:t xml:space="preserve">Read the reason it gives. Usually there is no empty row for an added field before the Forms section, or a sheet that rows can’t be inserted into (it holds an Excel table, a drawing or comments, or a pivot table reads from it). Use</w:t>
             </w:r>
             <w:r>
               <w:t xml:space="preserve"> </w:t>
@@ -10401,6 +10401,53 @@
             </w:r>
             <w:r>
               <w:t xml:space="preserve">, or add empty rows in Excel and reload</w:t>
+            </w:r>
+          </w:p>
+        </w:tc>
+      </w:tr>
+      <w:tr>
+        <w:tc>
+          <w:tcPr/>
+          <w:p>
+            <w:pPr>
+              <w:pStyle w:val="Compact"/>
+              <w:jc w:val="left"/>
+            </w:pPr>
+            <w:r>
+              <w:t xml:space="preserve">“</w:t>
+            </w:r>
+            <w:r>
+              <w:t xml:space="preserve">Text length must not exceed 32767 characters</w:t>
+            </w:r>
+            <w:r>
+              <w:t xml:space="preserve">”</w:t>
+            </w:r>
+            <w:r>
+              <w:t xml:space="preserve">, or a note that text was too long for Excel</w:t>
+            </w:r>
+          </w:p>
+        </w:tc>
+        <w:tc>
+          <w:tcPr/>
+          <w:p>
+            <w:pPr>
+              <w:pStyle w:val="Compact"/>
+              <w:jc w:val="left"/>
+            </w:pPr>
+            <w:r>
+              <w:t xml:space="preserve">Excel holds at most 32,767 characters in a cell. Longer text (often a long list of choice options in Additional data) is cut to fit and ends with</w:t>
+            </w:r>
+            <w:r>
+              <w:t xml:space="preserve"> </w:t>
+            </w:r>
+            <w:r>
+              <w:rPr>
+                <w:rStyle w:val="VerbatimChar"/>
+              </w:rPr>
+              <w:t xml:space="preserve">[cut: … this had N]</w:t>
+            </w:r>
+            <w:r>
+              <w:t xml:space="preserve">; the page lists the cells. Shorten the text in the workbook if the full list matters</w:t>
             </w:r>
           </w:p>
         </w:tc>

</xml_diff>